<commit_message>
docs: add ADECCO training report document
</commit_message>
<xml_diff>
--- a/OI/Chateauneuf_CEI_ADECCO_23_25_mars/Bilan_Formation_ADECCO.docx
+++ b/OI/Chateauneuf_CEI_ADECCO_23_25_mars/Bilan_Formation_ADECCO.docx
@@ -20,7 +20,21 @@
           <w:b/>
           <w:bCs/>
         </w:rPr>
-        <w:t>Référence :</w:t>
+        <w:t>Référence</w:t>
+      </w:r>
+      <w:r>
+        <w:rPr>
+          <w:b/>
+          <w:bCs/>
+        </w:rPr>
+        <w:t xml:space="preserve"> Groupe</w:t>
+      </w:r>
+      <w:r>
+        <w:rPr>
+          <w:b/>
+          <w:bCs/>
+        </w:rPr>
+        <w:t xml:space="preserve"> :</w:t>
       </w:r>
       <w:r>
         <w:t xml:space="preserve"> E28_10579 CEI</w:t>
@@ -56,19 +70,6 @@
       </w:r>
       <w:r>
         <w:t>, 2 Rue de la liberté — 45110 Châteauneuf-sur-Loire</w:t>
-      </w:r>
-      <w:r>
-        <w:br/>
-      </w:r>
-      <w:r>
-        <w:rPr>
-          <w:b/>
-          <w:bCs/>
-        </w:rPr>
-        <w:t>Formateur :</w:t>
-      </w:r>
-      <w:r>
-        <w:t xml:space="preserve"> Stéphane JAUBERT</w:t>
       </w:r>
       <w:r>
         <w:br/>
@@ -253,18 +254,14 @@
           <w:i/>
           <w:iCs/>
         </w:rPr>
-        <w:t xml:space="preserve">, véritable cœur de l’apprentissage </w:t>
-      </w:r>
-      <w:r>
-        <w:rPr>
-          <w:i/>
-          <w:iCs/>
-        </w:rPr>
+        <w:t>, véritable cœur de l’apprentissage du flux tiré.</w:t>
+      </w:r>
+      <w:r>
+        <w:t xml:space="preserve"> - Pour aller plus loin qu’une simple découverte, le jeu a été poussé de manière </w:t>
+      </w:r>
+      <w:r>
         <w:lastRenderedPageBreak/>
-        <w:t>du flux tiré.</w:t>
-      </w:r>
-      <w:r>
-        <w:t xml:space="preserve"> - Pour aller plus loin qu’une simple découverte, le jeu a été poussé de manière inédite avec </w:t>
+        <w:t xml:space="preserve">inédite avec </w:t>
       </w:r>
       <w:r>
         <w:rPr>

</xml_diff>